<commit_message>
Refactor award selection behavior, enhance external organizations metadata fetching, add unit tests for abstract statistics, and implement UsersSyncService for user data synchronization
- Set selectableRows to false in awards-sense-naturalesa.html and added cellClick functionality for row selection.
- Updated external organizations metadata fetching in organizaciones-externas-kpis.html to include associatedPerson and display it in the UI.
- Added unit tests in DemoApplicationTests.java to validate dynamic abstracts statistics.
- Created UsersSyncService.java to handle user data synchronization with custom index rebuilding.
</commit_message>
<xml_diff>
--- a/src/main/resources/plantilla_certificats_angles.docx
+++ b/src/main/resources/plantilla_certificats_angles.docx
@@ -1,6 +1,6 @@
 
 <file path=word/document.xml><?xml version="1.0" encoding="utf-8"?>
-<w:document xmlns:wpc="http://schemas.microsoft.com/office/word/2010/wordprocessingCanvas" xmlns:cx="http://schemas.microsoft.com/office/drawing/2014/chartex" xmlns:cx1="http://schemas.microsoft.com/office/drawing/2015/9/8/chartex" xmlns:cx2="http://schemas.microsoft.com/office/drawing/2015/10/21/chartex" xmlns:cx3="http://schemas.microsoft.com/office/drawing/2016/5/9/chartex" xmlns:cx4="http://schemas.microsoft.com/office/drawing/2016/5/10/chartex" xmlns:cx5="http://schemas.microsoft.com/office/drawing/2016/5/11/chartex" xmlns:cx6="http://schemas.microsoft.com/office/drawing/2016/5/12/chartex" xmlns:cx7="http://schemas.microsoft.com/office/drawing/2016/5/13/chartex" xmlns:cx8="http://schemas.microsoft.com/office/drawing/2016/5/14/chartex" xmlns:mc="http://schemas.openxmlformats.org/markup-compatibility/2006" xmlns:aink="http://schemas.microsoft.com/office/drawing/2016/ink" xmlns:am3d="http://schemas.microsoft.com/office/drawing/2017/model3d" xmlns:o="urn:schemas-microsoft-com:office:office" xmlns:oel="http://schemas.microsoft.com/office/2019/extlst" xmlns:r="http://schemas.openxmlformats.org/officeDocument/2006/relationships" xmlns:m="http://schemas.openxmlformats.org/officeDocument/2006/math" xmlns:v="urn:schemas-microsoft-com:vml" xmlns:wp14="http://schemas.microsoft.com/office/word/2010/wordprocessingDrawing" xmlns:wp="http://schemas.openxmlformats.org/drawingml/2006/wordprocessingDrawing" xmlns:w10="urn:schemas-microsoft-com:office:word" xmlns:w="http://schemas.openxmlformats.org/wordprocessingml/2006/main" xmlns:w14="http://schemas.microsoft.com/office/word/2010/wordml" xmlns:w15="http://schemas.microsoft.com/office/word/2012/wordml" xmlns:w16cex="http://schemas.microsoft.com/office/word/2018/wordml/cex" xmlns:w16cid="http://schemas.microsoft.com/office/word/2016/wordml/cid" xmlns:w16="http://schemas.microsoft.com/office/word/2018/wordml" xmlns:w16du="http://schemas.microsoft.com/office/word/2023/wordml/word16du" xmlns:w16sdtdh="http://schemas.microsoft.com/office/word/2020/wordml/sdtdatahash" xmlns:w16se="http://schemas.microsoft.com/office/word/2015/wordml/symex" xmlns:wpg="http://schemas.microsoft.com/office/word/2010/wordprocessingGroup" xmlns:wpi="http://schemas.microsoft.com/office/word/2010/wordprocessingInk" xmlns:wne="http://schemas.microsoft.com/office/word/2006/wordml" xmlns:wps="http://schemas.microsoft.com/office/word/2010/wordprocessingShape" mc:Ignorable="w14 w15 w16se w16cid w16 w16cex w16sdtdh w16du wp14">
+<w:document xmlns:wpc="http://schemas.microsoft.com/office/word/2010/wordprocessingCanvas" xmlns:cx="http://schemas.microsoft.com/office/drawing/2014/chartex" xmlns:cx1="http://schemas.microsoft.com/office/drawing/2015/9/8/chartex" xmlns:cx2="http://schemas.microsoft.com/office/drawing/2015/10/21/chartex" xmlns:cx3="http://schemas.microsoft.com/office/drawing/2016/5/9/chartex" xmlns:cx4="http://schemas.microsoft.com/office/drawing/2016/5/10/chartex" xmlns:cx5="http://schemas.microsoft.com/office/drawing/2016/5/11/chartex" xmlns:cx6="http://schemas.microsoft.com/office/drawing/2016/5/12/chartex" xmlns:cx7="http://schemas.microsoft.com/office/drawing/2016/5/13/chartex" xmlns:cx8="http://schemas.microsoft.com/office/drawing/2016/5/14/chartex" xmlns:mc="http://schemas.openxmlformats.org/markup-compatibility/2006" xmlns:aink="http://schemas.microsoft.com/office/drawing/2016/ink" xmlns:am3d="http://schemas.microsoft.com/office/drawing/2017/model3d" xmlns:o="urn:schemas-microsoft-com:office:office" xmlns:oel="http://schemas.microsoft.com/office/2019/extlst" xmlns:r="http://schemas.openxmlformats.org/officeDocument/2006/relationships" xmlns:m="http://schemas.openxmlformats.org/officeDocument/2006/math" xmlns:v="urn:schemas-microsoft-com:vml" xmlns:wp14="http://schemas.microsoft.com/office/word/2010/wordprocessingDrawing" xmlns:wp="http://schemas.openxmlformats.org/drawingml/2006/wordprocessingDrawing" xmlns:w10="urn:schemas-microsoft-com:office:word" xmlns:w="http://schemas.openxmlformats.org/wordprocessingml/2006/main" xmlns:w14="http://schemas.microsoft.com/office/word/2010/wordml" xmlns:w15="http://schemas.microsoft.com/office/word/2012/wordml" xmlns:w16cex="http://schemas.microsoft.com/office/word/2018/wordml/cex" xmlns:w16cid="http://schemas.microsoft.com/office/word/2016/wordml/cid" xmlns:w16="http://schemas.microsoft.com/office/word/2018/wordml" xmlns:w16du="http://schemas.microsoft.com/office/word/2023/wordml/word16du" xmlns:w16sdtdh="http://schemas.microsoft.com/office/word/2020/wordml/sdtdatahash" xmlns:w16sdtfl="http://schemas.microsoft.com/office/word/2024/wordml/sdtformatlock" xmlns:w16se="http://schemas.microsoft.com/office/word/2015/wordml/symex" xmlns:wpg="http://schemas.microsoft.com/office/word/2010/wordprocessingGroup" xmlns:wpi="http://schemas.microsoft.com/office/word/2010/wordprocessingInk" xmlns:wne="http://schemas.microsoft.com/office/word/2006/wordml" xmlns:wps="http://schemas.microsoft.com/office/word/2010/wordprocessingShape" mc:Ignorable="w14 w15 w16se w16cid w16 w16cex w16sdtdh w16sdtfl w16du wp14">
   <w:body>
     <w:p>
       <w:pPr>
@@ -25,7 +25,14 @@
           <w:rFonts w:asciiTheme="minorHAnsi" w:hAnsiTheme="minorHAnsi" w:cstheme="minorHAnsi"/>
           <w:lang w:val="en-US"/>
         </w:rPr>
-        <w:t xml:space="preserve">Assumpció Malgosa Morera, vice chancellor of Investigation in the Autonomous University of Barcelona </w:t>
+        <w:t>Albert Ruiz Cirera</w:t>
+      </w:r>
+      <w:r>
+        <w:rPr>
+          <w:rFonts w:asciiTheme="minorHAnsi" w:hAnsiTheme="minorHAnsi" w:cstheme="minorHAnsi"/>
+          <w:lang w:val="en-US"/>
+        </w:rPr>
+        <w:t xml:space="preserve">, vice chancellor of Investigation in the Autonomous University of Barcelona </w:t>
       </w:r>
     </w:p>
     <w:p>
@@ -125,11 +132,13 @@
         <w:jc w:val="both"/>
         <w:rPr>
           <w:rFonts w:asciiTheme="minorHAnsi" w:hAnsiTheme="minorHAnsi" w:cstheme="minorHAnsi"/>
+          <w:lang w:val="en-US"/>
         </w:rPr>
       </w:pPr>
       <w:r>
         <w:rPr>
           <w:rFonts w:asciiTheme="minorHAnsi" w:hAnsiTheme="minorHAnsi" w:cstheme="minorHAnsi"/>
+          <w:lang w:val="en-US"/>
         </w:rPr>
         <w:t xml:space="preserve"> </w:t>
       </w:r>
@@ -147,7 +156,7 @@
 </file>
 
 <file path=word/endnotes.xml><?xml version="1.0" encoding="utf-8"?>
-<w:endnotes xmlns:wpc="http://schemas.microsoft.com/office/word/2010/wordprocessingCanvas" xmlns:cx="http://schemas.microsoft.com/office/drawing/2014/chartex" xmlns:cx1="http://schemas.microsoft.com/office/drawing/2015/9/8/chartex" xmlns:cx2="http://schemas.microsoft.com/office/drawing/2015/10/21/chartex" xmlns:cx3="http://schemas.microsoft.com/office/drawing/2016/5/9/chartex" xmlns:cx4="http://schemas.microsoft.com/office/drawing/2016/5/10/chartex" xmlns:cx5="http://schemas.microsoft.com/office/drawing/2016/5/11/chartex" xmlns:cx6="http://schemas.microsoft.com/office/drawing/2016/5/12/chartex" xmlns:cx7="http://schemas.microsoft.com/office/drawing/2016/5/13/chartex" xmlns:cx8="http://schemas.microsoft.com/office/drawing/2016/5/14/chartex" xmlns:mc="http://schemas.openxmlformats.org/markup-compatibility/2006" xmlns:aink="http://schemas.microsoft.com/office/drawing/2016/ink" xmlns:am3d="http://schemas.microsoft.com/office/drawing/2017/model3d" xmlns:o="urn:schemas-microsoft-com:office:office" xmlns:oel="http://schemas.microsoft.com/office/2019/extlst" xmlns:r="http://schemas.openxmlformats.org/officeDocument/2006/relationships" xmlns:m="http://schemas.openxmlformats.org/officeDocument/2006/math" xmlns:v="urn:schemas-microsoft-com:vml" xmlns:wp14="http://schemas.microsoft.com/office/word/2010/wordprocessingDrawing" xmlns:wp="http://schemas.openxmlformats.org/drawingml/2006/wordprocessingDrawing" xmlns:w10="urn:schemas-microsoft-com:office:word" xmlns:w="http://schemas.openxmlformats.org/wordprocessingml/2006/main" xmlns:w14="http://schemas.microsoft.com/office/word/2010/wordml" xmlns:w15="http://schemas.microsoft.com/office/word/2012/wordml" xmlns:w16cex="http://schemas.microsoft.com/office/word/2018/wordml/cex" xmlns:w16cid="http://schemas.microsoft.com/office/word/2016/wordml/cid" xmlns:w16="http://schemas.microsoft.com/office/word/2018/wordml" xmlns:w16du="http://schemas.microsoft.com/office/word/2023/wordml/word16du" xmlns:w16sdtdh="http://schemas.microsoft.com/office/word/2020/wordml/sdtdatahash" xmlns:w16se="http://schemas.microsoft.com/office/word/2015/wordml/symex" xmlns:wpg="http://schemas.microsoft.com/office/word/2010/wordprocessingGroup" xmlns:wpi="http://schemas.microsoft.com/office/word/2010/wordprocessingInk" xmlns:wne="http://schemas.microsoft.com/office/word/2006/wordml" xmlns:wps="http://schemas.microsoft.com/office/word/2010/wordprocessingShape" mc:Ignorable="w14 w15 w16se w16cid w16 w16cex w16sdtdh w16du wp14">
+<w:endnotes xmlns:wpc="http://schemas.microsoft.com/office/word/2010/wordprocessingCanvas" xmlns:cx="http://schemas.microsoft.com/office/drawing/2014/chartex" xmlns:cx1="http://schemas.microsoft.com/office/drawing/2015/9/8/chartex" xmlns:cx2="http://schemas.microsoft.com/office/drawing/2015/10/21/chartex" xmlns:cx3="http://schemas.microsoft.com/office/drawing/2016/5/9/chartex" xmlns:cx4="http://schemas.microsoft.com/office/drawing/2016/5/10/chartex" xmlns:cx5="http://schemas.microsoft.com/office/drawing/2016/5/11/chartex" xmlns:cx6="http://schemas.microsoft.com/office/drawing/2016/5/12/chartex" xmlns:cx7="http://schemas.microsoft.com/office/drawing/2016/5/13/chartex" xmlns:cx8="http://schemas.microsoft.com/office/drawing/2016/5/14/chartex" xmlns:mc="http://schemas.openxmlformats.org/markup-compatibility/2006" xmlns:aink="http://schemas.microsoft.com/office/drawing/2016/ink" xmlns:am3d="http://schemas.microsoft.com/office/drawing/2017/model3d" xmlns:o="urn:schemas-microsoft-com:office:office" xmlns:oel="http://schemas.microsoft.com/office/2019/extlst" xmlns:r="http://schemas.openxmlformats.org/officeDocument/2006/relationships" xmlns:m="http://schemas.openxmlformats.org/officeDocument/2006/math" xmlns:v="urn:schemas-microsoft-com:vml" xmlns:wp14="http://schemas.microsoft.com/office/word/2010/wordprocessingDrawing" xmlns:wp="http://schemas.openxmlformats.org/drawingml/2006/wordprocessingDrawing" xmlns:w10="urn:schemas-microsoft-com:office:word" xmlns:w="http://schemas.openxmlformats.org/wordprocessingml/2006/main" xmlns:w14="http://schemas.microsoft.com/office/word/2010/wordml" xmlns:w15="http://schemas.microsoft.com/office/word/2012/wordml" xmlns:w16cex="http://schemas.microsoft.com/office/word/2018/wordml/cex" xmlns:w16cid="http://schemas.microsoft.com/office/word/2016/wordml/cid" xmlns:w16="http://schemas.microsoft.com/office/word/2018/wordml" xmlns:w16du="http://schemas.microsoft.com/office/word/2023/wordml/word16du" xmlns:w16sdtdh="http://schemas.microsoft.com/office/word/2020/wordml/sdtdatahash" xmlns:w16sdtfl="http://schemas.microsoft.com/office/word/2024/wordml/sdtformatlock" xmlns:w16se="http://schemas.microsoft.com/office/word/2015/wordml/symex" xmlns:wpg="http://schemas.microsoft.com/office/word/2010/wordprocessingGroup" xmlns:wpi="http://schemas.microsoft.com/office/word/2010/wordprocessingInk" xmlns:wne="http://schemas.microsoft.com/office/word/2006/wordml" xmlns:wps="http://schemas.microsoft.com/office/word/2010/wordprocessingShape" mc:Ignorable="w14 w15 w16se w16cid w16 w16cex w16sdtdh w16sdtfl w16du wp14">
   <w:endnote w:type="separator" w:id="-1">
     <w:p>
       <w:r>
@@ -169,7 +178,7 @@
 </file>
 
 <file path=word/footer1.xml><?xml version="1.0" encoding="utf-8"?>
-<w:ftr xmlns:wpc="http://schemas.microsoft.com/office/word/2010/wordprocessingCanvas" xmlns:cx="http://schemas.microsoft.com/office/drawing/2014/chartex" xmlns:cx1="http://schemas.microsoft.com/office/drawing/2015/9/8/chartex" xmlns:cx2="http://schemas.microsoft.com/office/drawing/2015/10/21/chartex" xmlns:cx3="http://schemas.microsoft.com/office/drawing/2016/5/9/chartex" xmlns:cx4="http://schemas.microsoft.com/office/drawing/2016/5/10/chartex" xmlns:cx5="http://schemas.microsoft.com/office/drawing/2016/5/11/chartex" xmlns:cx6="http://schemas.microsoft.com/office/drawing/2016/5/12/chartex" xmlns:cx7="http://schemas.microsoft.com/office/drawing/2016/5/13/chartex" xmlns:cx8="http://schemas.microsoft.com/office/drawing/2016/5/14/chartex" xmlns:mc="http://schemas.openxmlformats.org/markup-compatibility/2006" xmlns:aink="http://schemas.microsoft.com/office/drawing/2016/ink" xmlns:am3d="http://schemas.microsoft.com/office/drawing/2017/model3d" xmlns:o="urn:schemas-microsoft-com:office:office" xmlns:oel="http://schemas.microsoft.com/office/2019/extlst" xmlns:r="http://schemas.openxmlformats.org/officeDocument/2006/relationships" xmlns:m="http://schemas.openxmlformats.org/officeDocument/2006/math" xmlns:v="urn:schemas-microsoft-com:vml" xmlns:wp14="http://schemas.microsoft.com/office/word/2010/wordprocessingDrawing" xmlns:wp="http://schemas.openxmlformats.org/drawingml/2006/wordprocessingDrawing" xmlns:w10="urn:schemas-microsoft-com:office:word" xmlns:w="http://schemas.openxmlformats.org/wordprocessingml/2006/main" xmlns:w14="http://schemas.microsoft.com/office/word/2010/wordml" xmlns:w15="http://schemas.microsoft.com/office/word/2012/wordml" xmlns:w16cex="http://schemas.microsoft.com/office/word/2018/wordml/cex" xmlns:w16cid="http://schemas.microsoft.com/office/word/2016/wordml/cid" xmlns:w16="http://schemas.microsoft.com/office/word/2018/wordml" xmlns:w16du="http://schemas.microsoft.com/office/word/2023/wordml/word16du" xmlns:w16sdtdh="http://schemas.microsoft.com/office/word/2020/wordml/sdtdatahash" xmlns:w16se="http://schemas.microsoft.com/office/word/2015/wordml/symex" xmlns:wpg="http://schemas.microsoft.com/office/word/2010/wordprocessingGroup" xmlns:wpi="http://schemas.microsoft.com/office/word/2010/wordprocessingInk" xmlns:wne="http://schemas.microsoft.com/office/word/2006/wordml" xmlns:wps="http://schemas.microsoft.com/office/word/2010/wordprocessingShape" mc:Ignorable="w14 w15 w16se w16cid w16 w16cex w16sdtdh w16du wp14">
+<w:ftr xmlns:wpc="http://schemas.microsoft.com/office/word/2010/wordprocessingCanvas" xmlns:cx="http://schemas.microsoft.com/office/drawing/2014/chartex" xmlns:cx1="http://schemas.microsoft.com/office/drawing/2015/9/8/chartex" xmlns:cx2="http://schemas.microsoft.com/office/drawing/2015/10/21/chartex" xmlns:cx3="http://schemas.microsoft.com/office/drawing/2016/5/9/chartex" xmlns:cx4="http://schemas.microsoft.com/office/drawing/2016/5/10/chartex" xmlns:cx5="http://schemas.microsoft.com/office/drawing/2016/5/11/chartex" xmlns:cx6="http://schemas.microsoft.com/office/drawing/2016/5/12/chartex" xmlns:cx7="http://schemas.microsoft.com/office/drawing/2016/5/13/chartex" xmlns:cx8="http://schemas.microsoft.com/office/drawing/2016/5/14/chartex" xmlns:mc="http://schemas.openxmlformats.org/markup-compatibility/2006" xmlns:aink="http://schemas.microsoft.com/office/drawing/2016/ink" xmlns:am3d="http://schemas.microsoft.com/office/drawing/2017/model3d" xmlns:o="urn:schemas-microsoft-com:office:office" xmlns:oel="http://schemas.microsoft.com/office/2019/extlst" xmlns:r="http://schemas.openxmlformats.org/officeDocument/2006/relationships" xmlns:m="http://schemas.openxmlformats.org/officeDocument/2006/math" xmlns:v="urn:schemas-microsoft-com:vml" xmlns:wp14="http://schemas.microsoft.com/office/word/2010/wordprocessingDrawing" xmlns:wp="http://schemas.openxmlformats.org/drawingml/2006/wordprocessingDrawing" xmlns:w10="urn:schemas-microsoft-com:office:word" xmlns:w="http://schemas.openxmlformats.org/wordprocessingml/2006/main" xmlns:w14="http://schemas.microsoft.com/office/word/2010/wordml" xmlns:w15="http://schemas.microsoft.com/office/word/2012/wordml" xmlns:w16cex="http://schemas.microsoft.com/office/word/2018/wordml/cex" xmlns:w16cid="http://schemas.microsoft.com/office/word/2016/wordml/cid" xmlns:w16="http://schemas.microsoft.com/office/word/2018/wordml" xmlns:w16du="http://schemas.microsoft.com/office/word/2023/wordml/word16du" xmlns:w16sdtdh="http://schemas.microsoft.com/office/word/2020/wordml/sdtdatahash" xmlns:w16sdtfl="http://schemas.microsoft.com/office/word/2024/wordml/sdtformatlock" xmlns:w16se="http://schemas.microsoft.com/office/word/2015/wordml/symex" xmlns:wpg="http://schemas.microsoft.com/office/word/2010/wordprocessingGroup" xmlns:wpi="http://schemas.microsoft.com/office/word/2010/wordprocessingInk" xmlns:wne="http://schemas.microsoft.com/office/word/2006/wordml" xmlns:wps="http://schemas.microsoft.com/office/word/2010/wordprocessingShape" mc:Ignorable="w14 w15 w16se w16cid w16 w16cex w16sdtdh w16sdtfl w16du wp14">
   <w:p>
     <w:pPr>
       <w:pStyle w:val="Peu"/>
@@ -201,7 +210,7 @@
 </file>
 
 <file path=word/footnotes.xml><?xml version="1.0" encoding="utf-8"?>
-<w:footnotes xmlns:wpc="http://schemas.microsoft.com/office/word/2010/wordprocessingCanvas" xmlns:cx="http://schemas.microsoft.com/office/drawing/2014/chartex" xmlns:cx1="http://schemas.microsoft.com/office/drawing/2015/9/8/chartex" xmlns:cx2="http://schemas.microsoft.com/office/drawing/2015/10/21/chartex" xmlns:cx3="http://schemas.microsoft.com/office/drawing/2016/5/9/chartex" xmlns:cx4="http://schemas.microsoft.com/office/drawing/2016/5/10/chartex" xmlns:cx5="http://schemas.microsoft.com/office/drawing/2016/5/11/chartex" xmlns:cx6="http://schemas.microsoft.com/office/drawing/2016/5/12/chartex" xmlns:cx7="http://schemas.microsoft.com/office/drawing/2016/5/13/chartex" xmlns:cx8="http://schemas.microsoft.com/office/drawing/2016/5/14/chartex" xmlns:mc="http://schemas.openxmlformats.org/markup-compatibility/2006" xmlns:aink="http://schemas.microsoft.com/office/drawing/2016/ink" xmlns:am3d="http://schemas.microsoft.com/office/drawing/2017/model3d" xmlns:o="urn:schemas-microsoft-com:office:office" xmlns:oel="http://schemas.microsoft.com/office/2019/extlst" xmlns:r="http://schemas.openxmlformats.org/officeDocument/2006/relationships" xmlns:m="http://schemas.openxmlformats.org/officeDocument/2006/math" xmlns:v="urn:schemas-microsoft-com:vml" xmlns:wp14="http://schemas.microsoft.com/office/word/2010/wordprocessingDrawing" xmlns:wp="http://schemas.openxmlformats.org/drawingml/2006/wordprocessingDrawing" xmlns:w10="urn:schemas-microsoft-com:office:word" xmlns:w="http://schemas.openxmlformats.org/wordprocessingml/2006/main" xmlns:w14="http://schemas.microsoft.com/office/word/2010/wordml" xmlns:w15="http://schemas.microsoft.com/office/word/2012/wordml" xmlns:w16cex="http://schemas.microsoft.com/office/word/2018/wordml/cex" xmlns:w16cid="http://schemas.microsoft.com/office/word/2016/wordml/cid" xmlns:w16="http://schemas.microsoft.com/office/word/2018/wordml" xmlns:w16du="http://schemas.microsoft.com/office/word/2023/wordml/word16du" xmlns:w16sdtdh="http://schemas.microsoft.com/office/word/2020/wordml/sdtdatahash" xmlns:w16se="http://schemas.microsoft.com/office/word/2015/wordml/symex" xmlns:wpg="http://schemas.microsoft.com/office/word/2010/wordprocessingGroup" xmlns:wpi="http://schemas.microsoft.com/office/word/2010/wordprocessingInk" xmlns:wne="http://schemas.microsoft.com/office/word/2006/wordml" xmlns:wps="http://schemas.microsoft.com/office/word/2010/wordprocessingShape" mc:Ignorable="w14 w15 w16se w16cid w16 w16cex w16sdtdh w16du wp14">
+<w:footnotes xmlns:wpc="http://schemas.microsoft.com/office/word/2010/wordprocessingCanvas" xmlns:cx="http://schemas.microsoft.com/office/drawing/2014/chartex" xmlns:cx1="http://schemas.microsoft.com/office/drawing/2015/9/8/chartex" xmlns:cx2="http://schemas.microsoft.com/office/drawing/2015/10/21/chartex" xmlns:cx3="http://schemas.microsoft.com/office/drawing/2016/5/9/chartex" xmlns:cx4="http://schemas.microsoft.com/office/drawing/2016/5/10/chartex" xmlns:cx5="http://schemas.microsoft.com/office/drawing/2016/5/11/chartex" xmlns:cx6="http://schemas.microsoft.com/office/drawing/2016/5/12/chartex" xmlns:cx7="http://schemas.microsoft.com/office/drawing/2016/5/13/chartex" xmlns:cx8="http://schemas.microsoft.com/office/drawing/2016/5/14/chartex" xmlns:mc="http://schemas.openxmlformats.org/markup-compatibility/2006" xmlns:aink="http://schemas.microsoft.com/office/drawing/2016/ink" xmlns:am3d="http://schemas.microsoft.com/office/drawing/2017/model3d" xmlns:o="urn:schemas-microsoft-com:office:office" xmlns:oel="http://schemas.microsoft.com/office/2019/extlst" xmlns:r="http://schemas.openxmlformats.org/officeDocument/2006/relationships" xmlns:m="http://schemas.openxmlformats.org/officeDocument/2006/math" xmlns:v="urn:schemas-microsoft-com:vml" xmlns:wp14="http://schemas.microsoft.com/office/word/2010/wordprocessingDrawing" xmlns:wp="http://schemas.openxmlformats.org/drawingml/2006/wordprocessingDrawing" xmlns:w10="urn:schemas-microsoft-com:office:word" xmlns:w="http://schemas.openxmlformats.org/wordprocessingml/2006/main" xmlns:w14="http://schemas.microsoft.com/office/word/2010/wordml" xmlns:w15="http://schemas.microsoft.com/office/word/2012/wordml" xmlns:w16cex="http://schemas.microsoft.com/office/word/2018/wordml/cex" xmlns:w16cid="http://schemas.microsoft.com/office/word/2016/wordml/cid" xmlns:w16="http://schemas.microsoft.com/office/word/2018/wordml" xmlns:w16du="http://schemas.microsoft.com/office/word/2023/wordml/word16du" xmlns:w16sdtdh="http://schemas.microsoft.com/office/word/2020/wordml/sdtdatahash" xmlns:w16sdtfl="http://schemas.microsoft.com/office/word/2024/wordml/sdtformatlock" xmlns:w16se="http://schemas.microsoft.com/office/word/2015/wordml/symex" xmlns:wpg="http://schemas.microsoft.com/office/word/2010/wordprocessingGroup" xmlns:wpi="http://schemas.microsoft.com/office/word/2010/wordprocessingInk" xmlns:wne="http://schemas.microsoft.com/office/word/2006/wordml" xmlns:wps="http://schemas.microsoft.com/office/word/2010/wordprocessingShape" mc:Ignorable="w14 w15 w16se w16cid w16 w16cex w16sdtdh w16sdtfl w16du wp14">
   <w:footnote w:type="separator" w:id="-1">
     <w:p>
       <w:r>
@@ -223,7 +232,7 @@
 </file>
 
 <file path=word/header1.xml><?xml version="1.0" encoding="utf-8"?>
-<w:hdr xmlns:wpc="http://schemas.microsoft.com/office/word/2010/wordprocessingCanvas" xmlns:cx="http://schemas.microsoft.com/office/drawing/2014/chartex" xmlns:cx1="http://schemas.microsoft.com/office/drawing/2015/9/8/chartex" xmlns:cx2="http://schemas.microsoft.com/office/drawing/2015/10/21/chartex" xmlns:cx3="http://schemas.microsoft.com/office/drawing/2016/5/9/chartex" xmlns:cx4="http://schemas.microsoft.com/office/drawing/2016/5/10/chartex" xmlns:cx5="http://schemas.microsoft.com/office/drawing/2016/5/11/chartex" xmlns:cx6="http://schemas.microsoft.com/office/drawing/2016/5/12/chartex" xmlns:cx7="http://schemas.microsoft.com/office/drawing/2016/5/13/chartex" xmlns:cx8="http://schemas.microsoft.com/office/drawing/2016/5/14/chartex" xmlns:mc="http://schemas.openxmlformats.org/markup-compatibility/2006" xmlns:aink="http://schemas.microsoft.com/office/drawing/2016/ink" xmlns:am3d="http://schemas.microsoft.com/office/drawing/2017/model3d" xmlns:o="urn:schemas-microsoft-com:office:office" xmlns:oel="http://schemas.microsoft.com/office/2019/extlst" xmlns:r="http://schemas.openxmlformats.org/officeDocument/2006/relationships" xmlns:m="http://schemas.openxmlformats.org/officeDocument/2006/math" xmlns:v="urn:schemas-microsoft-com:vml" xmlns:wp14="http://schemas.microsoft.com/office/word/2010/wordprocessingDrawing" xmlns:wp="http://schemas.openxmlformats.org/drawingml/2006/wordprocessingDrawing" xmlns:w10="urn:schemas-microsoft-com:office:word" xmlns:w="http://schemas.openxmlformats.org/wordprocessingml/2006/main" xmlns:w14="http://schemas.microsoft.com/office/word/2010/wordml" xmlns:w15="http://schemas.microsoft.com/office/word/2012/wordml" xmlns:w16cex="http://schemas.microsoft.com/office/word/2018/wordml/cex" xmlns:w16cid="http://schemas.microsoft.com/office/word/2016/wordml/cid" xmlns:w16="http://schemas.microsoft.com/office/word/2018/wordml" xmlns:w16du="http://schemas.microsoft.com/office/word/2023/wordml/word16du" xmlns:w16sdtdh="http://schemas.microsoft.com/office/word/2020/wordml/sdtdatahash" xmlns:w16se="http://schemas.microsoft.com/office/word/2015/wordml/symex" xmlns:wpg="http://schemas.microsoft.com/office/word/2010/wordprocessingGroup" xmlns:wpi="http://schemas.microsoft.com/office/word/2010/wordprocessingInk" xmlns:wne="http://schemas.microsoft.com/office/word/2006/wordml" xmlns:wps="http://schemas.microsoft.com/office/word/2010/wordprocessingShape" mc:Ignorable="w14 w15 w16se w16cid w16 w16cex w16sdtdh w16du wp14">
+<w:hdr xmlns:wpc="http://schemas.microsoft.com/office/word/2010/wordprocessingCanvas" xmlns:cx="http://schemas.microsoft.com/office/drawing/2014/chartex" xmlns:cx1="http://schemas.microsoft.com/office/drawing/2015/9/8/chartex" xmlns:cx2="http://schemas.microsoft.com/office/drawing/2015/10/21/chartex" xmlns:cx3="http://schemas.microsoft.com/office/drawing/2016/5/9/chartex" xmlns:cx4="http://schemas.microsoft.com/office/drawing/2016/5/10/chartex" xmlns:cx5="http://schemas.microsoft.com/office/drawing/2016/5/11/chartex" xmlns:cx6="http://schemas.microsoft.com/office/drawing/2016/5/12/chartex" xmlns:cx7="http://schemas.microsoft.com/office/drawing/2016/5/13/chartex" xmlns:cx8="http://schemas.microsoft.com/office/drawing/2016/5/14/chartex" xmlns:mc="http://schemas.openxmlformats.org/markup-compatibility/2006" xmlns:aink="http://schemas.microsoft.com/office/drawing/2016/ink" xmlns:am3d="http://schemas.microsoft.com/office/drawing/2017/model3d" xmlns:o="urn:schemas-microsoft-com:office:office" xmlns:oel="http://schemas.microsoft.com/office/2019/extlst" xmlns:r="http://schemas.openxmlformats.org/officeDocument/2006/relationships" xmlns:m="http://schemas.openxmlformats.org/officeDocument/2006/math" xmlns:v="urn:schemas-microsoft-com:vml" xmlns:wp14="http://schemas.microsoft.com/office/word/2010/wordprocessingDrawing" xmlns:wp="http://schemas.openxmlformats.org/drawingml/2006/wordprocessingDrawing" xmlns:w10="urn:schemas-microsoft-com:office:word" xmlns:w="http://schemas.openxmlformats.org/wordprocessingml/2006/main" xmlns:w14="http://schemas.microsoft.com/office/word/2010/wordml" xmlns:w15="http://schemas.microsoft.com/office/word/2012/wordml" xmlns:w16cex="http://schemas.microsoft.com/office/word/2018/wordml/cex" xmlns:w16cid="http://schemas.microsoft.com/office/word/2016/wordml/cid" xmlns:w16="http://schemas.microsoft.com/office/word/2018/wordml" xmlns:w16du="http://schemas.microsoft.com/office/word/2023/wordml/word16du" xmlns:w16sdtdh="http://schemas.microsoft.com/office/word/2020/wordml/sdtdatahash" xmlns:w16sdtfl="http://schemas.microsoft.com/office/word/2024/wordml/sdtformatlock" xmlns:w16se="http://schemas.microsoft.com/office/word/2015/wordml/symex" xmlns:wpg="http://schemas.microsoft.com/office/word/2010/wordprocessingGroup" xmlns:wpi="http://schemas.microsoft.com/office/word/2010/wordprocessingInk" xmlns:wne="http://schemas.microsoft.com/office/word/2006/wordml" xmlns:wps="http://schemas.microsoft.com/office/word/2010/wordprocessingShape" mc:Ignorable="w14 w15 w16se w16cid w16 w16cex w16sdtdh w16sdtfl w16du wp14">
   <w:tbl>
     <w:tblPr>
       <w:tblStyle w:val="Taulaambquadrcula"/>
@@ -517,7 +526,7 @@
 </file>
 
 <file path=word/numbering.xml><?xml version="1.0" encoding="utf-8"?>
-<w:numbering xmlns:wpc="http://schemas.microsoft.com/office/word/2010/wordprocessingCanvas" xmlns:cx="http://schemas.microsoft.com/office/drawing/2014/chartex" xmlns:cx1="http://schemas.microsoft.com/office/drawing/2015/9/8/chartex" xmlns:cx2="http://schemas.microsoft.com/office/drawing/2015/10/21/chartex" xmlns:cx3="http://schemas.microsoft.com/office/drawing/2016/5/9/chartex" xmlns:cx4="http://schemas.microsoft.com/office/drawing/2016/5/10/chartex" xmlns:cx5="http://schemas.microsoft.com/office/drawing/2016/5/11/chartex" xmlns:cx6="http://schemas.microsoft.com/office/drawing/2016/5/12/chartex" xmlns:cx7="http://schemas.microsoft.com/office/drawing/2016/5/13/chartex" xmlns:cx8="http://schemas.microsoft.com/office/drawing/2016/5/14/chartex" xmlns:mc="http://schemas.openxmlformats.org/markup-compatibility/2006" xmlns:aink="http://schemas.microsoft.com/office/drawing/2016/ink" xmlns:am3d="http://schemas.microsoft.com/office/drawing/2017/model3d" xmlns:o="urn:schemas-microsoft-com:office:office" xmlns:oel="http://schemas.microsoft.com/office/2019/extlst" xmlns:r="http://schemas.openxmlformats.org/officeDocument/2006/relationships" xmlns:m="http://schemas.openxmlformats.org/officeDocument/2006/math" xmlns:v="urn:schemas-microsoft-com:vml" xmlns:wp14="http://schemas.microsoft.com/office/word/2010/wordprocessingDrawing" xmlns:wp="http://schemas.openxmlformats.org/drawingml/2006/wordprocessingDrawing" xmlns:w10="urn:schemas-microsoft-com:office:word" xmlns:w="http://schemas.openxmlformats.org/wordprocessingml/2006/main" xmlns:w14="http://schemas.microsoft.com/office/word/2010/wordml" xmlns:w15="http://schemas.microsoft.com/office/word/2012/wordml" xmlns:w16cex="http://schemas.microsoft.com/office/word/2018/wordml/cex" xmlns:w16cid="http://schemas.microsoft.com/office/word/2016/wordml/cid" xmlns:w16="http://schemas.microsoft.com/office/word/2018/wordml" xmlns:w16du="http://schemas.microsoft.com/office/word/2023/wordml/word16du" xmlns:w16sdtdh="http://schemas.microsoft.com/office/word/2020/wordml/sdtdatahash" xmlns:w16se="http://schemas.microsoft.com/office/word/2015/wordml/symex" xmlns:wpg="http://schemas.microsoft.com/office/word/2010/wordprocessingGroup" xmlns:wpi="http://schemas.microsoft.com/office/word/2010/wordprocessingInk" xmlns:wne="http://schemas.microsoft.com/office/word/2006/wordml" xmlns:wps="http://schemas.microsoft.com/office/word/2010/wordprocessingShape" mc:Ignorable="w14 w15 w16se w16cid w16 w16cex w16sdtdh w16du wp14">
+<w:numbering xmlns:wpc="http://schemas.microsoft.com/office/word/2010/wordprocessingCanvas" xmlns:cx="http://schemas.microsoft.com/office/drawing/2014/chartex" xmlns:cx1="http://schemas.microsoft.com/office/drawing/2015/9/8/chartex" xmlns:cx2="http://schemas.microsoft.com/office/drawing/2015/10/21/chartex" xmlns:cx3="http://schemas.microsoft.com/office/drawing/2016/5/9/chartex" xmlns:cx4="http://schemas.microsoft.com/office/drawing/2016/5/10/chartex" xmlns:cx5="http://schemas.microsoft.com/office/drawing/2016/5/11/chartex" xmlns:cx6="http://schemas.microsoft.com/office/drawing/2016/5/12/chartex" xmlns:cx7="http://schemas.microsoft.com/office/drawing/2016/5/13/chartex" xmlns:cx8="http://schemas.microsoft.com/office/drawing/2016/5/14/chartex" xmlns:mc="http://schemas.openxmlformats.org/markup-compatibility/2006" xmlns:aink="http://schemas.microsoft.com/office/drawing/2016/ink" xmlns:am3d="http://schemas.microsoft.com/office/drawing/2017/model3d" xmlns:o="urn:schemas-microsoft-com:office:office" xmlns:oel="http://schemas.microsoft.com/office/2019/extlst" xmlns:r="http://schemas.openxmlformats.org/officeDocument/2006/relationships" xmlns:m="http://schemas.openxmlformats.org/officeDocument/2006/math" xmlns:v="urn:schemas-microsoft-com:vml" xmlns:wp14="http://schemas.microsoft.com/office/word/2010/wordprocessingDrawing" xmlns:wp="http://schemas.openxmlformats.org/drawingml/2006/wordprocessingDrawing" xmlns:w10="urn:schemas-microsoft-com:office:word" xmlns:w="http://schemas.openxmlformats.org/wordprocessingml/2006/main" xmlns:w14="http://schemas.microsoft.com/office/word/2010/wordml" xmlns:w15="http://schemas.microsoft.com/office/word/2012/wordml" xmlns:w16cex="http://schemas.microsoft.com/office/word/2018/wordml/cex" xmlns:w16cid="http://schemas.microsoft.com/office/word/2016/wordml/cid" xmlns:w16="http://schemas.microsoft.com/office/word/2018/wordml" xmlns:w16du="http://schemas.microsoft.com/office/word/2023/wordml/word16du" xmlns:w16sdtdh="http://schemas.microsoft.com/office/word/2020/wordml/sdtdatahash" xmlns:w16sdtfl="http://schemas.microsoft.com/office/word/2024/wordml/sdtformatlock" xmlns:w16se="http://schemas.microsoft.com/office/word/2015/wordml/symex" xmlns:wpg="http://schemas.microsoft.com/office/word/2010/wordprocessingGroup" xmlns:wpi="http://schemas.microsoft.com/office/word/2010/wordprocessingInk" xmlns:wne="http://schemas.microsoft.com/office/word/2006/wordml" xmlns:wps="http://schemas.microsoft.com/office/word/2010/wordprocessingShape" mc:Ignorable="w14 w15 w16se w16cid w16 w16cex w16sdtdh w16sdtfl w16du wp14">
   <w:abstractNum w:abstractNumId="0" w15:restartNumberingAfterBreak="0">
     <w:nsid w:val="12894ED0"/>
     <w:multiLevelType w:val="hybridMultilevel"/>
@@ -950,7 +959,7 @@
 </file>
 
 <file path=word/styles.xml><?xml version="1.0" encoding="utf-8"?>
-<w:styles xmlns:mc="http://schemas.openxmlformats.org/markup-compatibility/2006" xmlns:r="http://schemas.openxmlformats.org/officeDocument/2006/relationships" xmlns:w="http://schemas.openxmlformats.org/wordprocessingml/2006/main" xmlns:w14="http://schemas.microsoft.com/office/word/2010/wordml" xmlns:w15="http://schemas.microsoft.com/office/word/2012/wordml" xmlns:w16cex="http://schemas.microsoft.com/office/word/2018/wordml/cex" xmlns:w16cid="http://schemas.microsoft.com/office/word/2016/wordml/cid" xmlns:w16="http://schemas.microsoft.com/office/word/2018/wordml" xmlns:w16du="http://schemas.microsoft.com/office/word/2023/wordml/word16du" xmlns:w16sdtdh="http://schemas.microsoft.com/office/word/2020/wordml/sdtdatahash" xmlns:w16se="http://schemas.microsoft.com/office/word/2015/wordml/symex" mc:Ignorable="w14 w15 w16se w16cid w16 w16cex w16sdtdh w16du">
+<w:styles xmlns:mc="http://schemas.openxmlformats.org/markup-compatibility/2006" xmlns:r="http://schemas.openxmlformats.org/officeDocument/2006/relationships" xmlns:w="http://schemas.openxmlformats.org/wordprocessingml/2006/main" xmlns:w14="http://schemas.microsoft.com/office/word/2010/wordml" xmlns:w15="http://schemas.microsoft.com/office/word/2012/wordml" xmlns:w16cex="http://schemas.microsoft.com/office/word/2018/wordml/cex" xmlns:w16cid="http://schemas.microsoft.com/office/word/2016/wordml/cid" xmlns:w16="http://schemas.microsoft.com/office/word/2018/wordml" xmlns:w16du="http://schemas.microsoft.com/office/word/2023/wordml/word16du" xmlns:w16sdtdh="http://schemas.microsoft.com/office/word/2020/wordml/sdtdatahash" xmlns:w16sdtfl="http://schemas.microsoft.com/office/word/2024/wordml/sdtformatlock" xmlns:w16se="http://schemas.microsoft.com/office/word/2015/wordml/symex" mc:Ignorable="w14 w15 w16se w16cid w16 w16cex w16sdtdh w16sdtfl w16du">
   <w:docDefaults>
     <w:rPrDefault>
       <w:rPr>
@@ -2050,9 +2059,12 @@
 </file>
 
 <file path=customXml/item1.xml><?xml version="1.0" encoding="utf-8"?>
-<p:properties xmlns:p="http://schemas.microsoft.com/office/2006/metadata/properties" xmlns:xsi="http://www.w3.org/2001/XMLSchema-instance" xmlns:pc="http://schemas.microsoft.com/office/infopath/2007/PartnerControls">
-  <documentManagement/>
-</p:properties>
+<?mso-contentType ?>
+<FormTemplates xmlns="http://schemas.microsoft.com/sharepoint/v3/contenttype/forms">
+  <Display>DocumentLibraryForm</Display>
+  <Edit>DocumentLibraryForm</Edit>
+  <New>DocumentLibraryForm</New>
+</FormTemplates>
 </file>
 
 <file path=customXml/item2.xml><?xml version="1.0" encoding="utf-8"?>
@@ -2279,19 +2291,15 @@
 </file>
 
 <file path=customXml/item3.xml><?xml version="1.0" encoding="utf-8"?>
-<?mso-contentType ?>
-<FormTemplates xmlns="http://schemas.microsoft.com/sharepoint/v3/contenttype/forms">
-  <Display>DocumentLibraryForm</Display>
-  <Edit>DocumentLibraryForm</Edit>
-  <New>DocumentLibraryForm</New>
-</FormTemplates>
+<p:properties xmlns:p="http://schemas.microsoft.com/office/2006/metadata/properties" xmlns:xsi="http://www.w3.org/2001/XMLSchema-instance" xmlns:pc="http://schemas.microsoft.com/office/infopath/2007/PartnerControls">
+  <documentManagement/>
+</p:properties>
 </file>
 
 <file path=customXml/itemProps1.xml><?xml version="1.0" encoding="utf-8"?>
-<ds:datastoreItem xmlns:ds="http://schemas.openxmlformats.org/officeDocument/2006/customXml" ds:itemID="{FEA01E33-2B3C-4A74-9EC8-2603B931F4E0}">
+<ds:datastoreItem xmlns:ds="http://schemas.openxmlformats.org/officeDocument/2006/customXml" ds:itemID="{67F7DC06-B9AE-435C-99DB-943458433D67}">
   <ds:schemaRefs>
-    <ds:schemaRef ds:uri="http://schemas.microsoft.com/office/2006/metadata/properties"/>
-    <ds:schemaRef ds:uri="http://schemas.microsoft.com/office/infopath/2007/PartnerControls"/>
+    <ds:schemaRef ds:uri="http://schemas.microsoft.com/sharepoint/v3/contenttype/forms"/>
   </ds:schemaRefs>
 </ds:datastoreItem>
 </file>
@@ -2316,9 +2324,10 @@
 </file>
 
 <file path=customXml/itemProps3.xml><?xml version="1.0" encoding="utf-8"?>
-<ds:datastoreItem xmlns:ds="http://schemas.openxmlformats.org/officeDocument/2006/customXml" ds:itemID="{67F7DC06-B9AE-435C-99DB-943458433D67}">
+<ds:datastoreItem xmlns:ds="http://schemas.openxmlformats.org/officeDocument/2006/customXml" ds:itemID="{FEA01E33-2B3C-4A74-9EC8-2603B931F4E0}">
   <ds:schemaRefs>
-    <ds:schemaRef ds:uri="http://schemas.microsoft.com/sharepoint/v3/contenttype/forms"/>
+    <ds:schemaRef ds:uri="http://schemas.microsoft.com/office/2006/metadata/properties"/>
+    <ds:schemaRef ds:uri="http://schemas.microsoft.com/office/infopath/2007/PartnerControls"/>
   </ds:schemaRefs>
 </ds:datastoreItem>
 </file>
</xml_diff>